<commit_message>
feat: MongoDB async backend, Telegram channel storage, test fixes, deployment config
</commit_message>
<xml_diff>
--- a/generated_logsheets/3HE_3PET1_0EST.docx
+++ b/generated_logsheets/3HE_3PET1_0EST.docx
@@ -42,8 +42,8 @@
       <w:tblGrid>
         <w:gridCol w:w="90"/>
         <w:gridCol w:w="630"/>
-        <w:gridCol w:w="1440"/>
-        <w:gridCol w:w="3207"/>
+        <w:gridCol w:w="1530"/>
+        <w:gridCol w:w="3117"/>
         <w:gridCol w:w="927"/>
         <w:gridCol w:w="1176"/>
         <w:gridCol w:w="495"/>
@@ -455,7 +455,7 @@
         </w:tc>
         <w:tc>
           <w:tcPr>
-            <w:tcW w:w="1440" w:type="dxa"/>
+            <w:tcW w:w="1530" w:type="dxa"/>
             <w:vMerge w:val="restart"/>
             <w:tcBorders>
               <w:right w:val="single" w:sz="4" w:space="0" w:color="auto"/>
@@ -485,7 +485,7 @@
         </w:tc>
         <w:tc>
           <w:tcPr>
-            <w:tcW w:w="4134" w:type="dxa"/>
+            <w:tcW w:w="4044" w:type="dxa"/>
             <w:gridSpan w:val="2"/>
             <w:vMerge w:val="restart"/>
             <w:tcBorders>
@@ -802,7 +802,7 @@
         </w:tc>
         <w:tc>
           <w:tcPr>
-            <w:tcW w:w="1440" w:type="dxa"/>
+            <w:tcW w:w="1530" w:type="dxa"/>
             <w:vMerge/>
             <w:tcBorders>
               <w:right w:val="single" w:sz="4" w:space="0" w:color="auto"/>
@@ -823,7 +823,7 @@
         </w:tc>
         <w:tc>
           <w:tcPr>
-            <w:tcW w:w="4134" w:type="dxa"/>
+            <w:tcW w:w="4044" w:type="dxa"/>
             <w:gridSpan w:val="2"/>
             <w:vMerge/>
             <w:tcBorders>
@@ -1096,7 +1096,7 @@
         </w:tc>
         <w:tc>
           <w:tcPr>
-            <w:tcW w:w="1440" w:type="dxa"/>
+            <w:tcW w:w="1530" w:type="dxa"/>
             <w:tcBorders>
               <w:right w:val="single" w:sz="4" w:space="0" w:color="auto"/>
             </w:tcBorders>
@@ -1116,7 +1116,7 @@
         </w:tc>
         <w:tc>
           <w:tcPr>
-            <w:tcW w:w="4134" w:type="dxa"/>
+            <w:tcW w:w="4044" w:type="dxa"/>
             <w:gridSpan w:val="2"/>
             <w:tcBorders>
               <w:left w:val="single" w:sz="4" w:space="0" w:color="auto"/>
@@ -1333,7 +1333,7 @@
         </w:tc>
         <w:tc>
           <w:tcPr>
-            <w:tcW w:w="1440" w:type="dxa"/>
+            <w:tcW w:w="1530" w:type="dxa"/>
             <w:tcBorders>
               <w:bottom w:val="single" w:sz="4" w:space="0" w:color="auto"/>
               <w:right w:val="single" w:sz="4" w:space="0" w:color="auto"/>
@@ -1354,7 +1354,7 @@
         </w:tc>
         <w:tc>
           <w:tcPr>
-            <w:tcW w:w="4134" w:type="dxa"/>
+            <w:tcW w:w="4044" w:type="dxa"/>
             <w:gridSpan w:val="2"/>
             <w:tcBorders>
               <w:left w:val="single" w:sz="4" w:space="0" w:color="auto"/>
@@ -1588,7 +1588,7 @@
         </w:tc>
         <w:tc>
           <w:tcPr>
-            <w:tcW w:w="1440" w:type="dxa"/>
+            <w:tcW w:w="1530" w:type="dxa"/>
             <w:tcBorders>
               <w:top w:val="single" w:sz="4" w:space="0" w:color="auto"/>
               <w:left w:val="single" w:sz="4" w:space="0" w:color="auto"/>
@@ -1611,7 +1611,7 @@
         </w:tc>
         <w:tc>
           <w:tcPr>
-            <w:tcW w:w="4134" w:type="dxa"/>
+            <w:tcW w:w="4044" w:type="dxa"/>
             <w:gridSpan w:val="2"/>
             <w:tcBorders>
               <w:top w:val="single" w:sz="4" w:space="0" w:color="auto"/>
@@ -1859,8 +1859,8 @@
       </w:tblPr>
       <w:tblGrid>
         <w:gridCol w:w="738"/>
-        <w:gridCol w:w="1440"/>
-        <w:gridCol w:w="3870"/>
+        <w:gridCol w:w="1507"/>
+        <w:gridCol w:w="3803"/>
         <w:gridCol w:w="1080"/>
         <w:gridCol w:w="1080"/>
         <w:gridCol w:w="990"/>
@@ -1906,7 +1906,7 @@
         </w:tc>
         <w:tc>
           <w:tcPr>
-            <w:tcW w:w="1440" w:type="dxa"/>
+            <w:tcW w:w="1507" w:type="dxa"/>
             <w:vMerge w:val="restart"/>
             <w:tcBorders>
               <w:right w:val="single" w:sz="4" w:space="0" w:color="auto"/>
@@ -1936,7 +1936,7 @@
         </w:tc>
         <w:tc>
           <w:tcPr>
-            <w:tcW w:w="3870" w:type="dxa"/>
+            <w:tcW w:w="3803" w:type="dxa"/>
             <w:vMerge w:val="restart"/>
             <w:tcBorders>
               <w:left w:val="single" w:sz="4" w:space="0" w:color="auto"/>
@@ -2228,7 +2228,7 @@
         </w:tc>
         <w:tc>
           <w:tcPr>
-            <w:tcW w:w="1440" w:type="dxa"/>
+            <w:tcW w:w="1507" w:type="dxa"/>
             <w:vMerge/>
             <w:tcBorders>
               <w:right w:val="single" w:sz="4" w:space="0" w:color="auto"/>
@@ -2249,7 +2249,7 @@
         </w:tc>
         <w:tc>
           <w:tcPr>
-            <w:tcW w:w="3870" w:type="dxa"/>
+            <w:tcW w:w="3803" w:type="dxa"/>
             <w:vMerge/>
             <w:tcBorders>
               <w:left w:val="single" w:sz="4" w:space="0" w:color="auto"/>
@@ -2513,7 +2513,7 @@
         </w:tc>
         <w:tc>
           <w:tcPr>
-            <w:tcW w:w="1440" w:type="dxa"/>
+            <w:tcW w:w="1507" w:type="dxa"/>
             <w:tcBorders>
               <w:right w:val="single" w:sz="4" w:space="0" w:color="auto"/>
             </w:tcBorders>
@@ -2533,7 +2533,7 @@
         </w:tc>
         <w:tc>
           <w:tcPr>
-            <w:tcW w:w="3870" w:type="dxa"/>
+            <w:tcW w:w="3803" w:type="dxa"/>
             <w:tcBorders>
               <w:left w:val="single" w:sz="4" w:space="0" w:color="auto"/>
             </w:tcBorders>
@@ -2750,7 +2750,7 @@
         </w:tc>
         <w:tc>
           <w:tcPr>
-            <w:tcW w:w="1440" w:type="dxa"/>
+            <w:tcW w:w="1507" w:type="dxa"/>
             <w:tcBorders>
               <w:right w:val="single" w:sz="4" w:space="0" w:color="auto"/>
             </w:tcBorders>
@@ -2770,7 +2770,7 @@
         </w:tc>
         <w:tc>
           <w:tcPr>
-            <w:tcW w:w="3870" w:type="dxa"/>
+            <w:tcW w:w="3803" w:type="dxa"/>
             <w:tcBorders>
               <w:left w:val="single" w:sz="4" w:space="0" w:color="auto"/>
             </w:tcBorders>
@@ -2968,7 +2968,7 @@
         </w:tc>
         <w:tc>
           <w:tcPr>
-            <w:tcW w:w="1440" w:type="dxa"/>
+            <w:tcW w:w="1507" w:type="dxa"/>
             <w:tcBorders>
               <w:right w:val="single" w:sz="4" w:space="0" w:color="auto"/>
             </w:tcBorders>
@@ -2988,7 +2988,7 @@
         </w:tc>
         <w:tc>
           <w:tcPr>
-            <w:tcW w:w="3870" w:type="dxa"/>
+            <w:tcW w:w="3803" w:type="dxa"/>
             <w:tcBorders>
               <w:left w:val="single" w:sz="4" w:space="0" w:color="auto"/>
             </w:tcBorders>
@@ -3173,7 +3173,7 @@
         </w:tc>
         <w:tc>
           <w:tcPr>
-            <w:tcW w:w="1440" w:type="dxa"/>
+            <w:tcW w:w="1507" w:type="dxa"/>
             <w:tcBorders>
               <w:right w:val="single" w:sz="4" w:space="0" w:color="auto"/>
             </w:tcBorders>
@@ -3193,7 +3193,7 @@
         </w:tc>
         <w:tc>
           <w:tcPr>
-            <w:tcW w:w="3870" w:type="dxa"/>
+            <w:tcW w:w="3803" w:type="dxa"/>
             <w:tcBorders>
               <w:left w:val="single" w:sz="4" w:space="0" w:color="auto"/>
             </w:tcBorders>
@@ -3303,8 +3303,6 @@
                 <w:szCs w:val="32"/>
               </w:rPr>
             </w:pPr>
-            <w:bookmarkStart w:id="0" w:name="_GoBack"/>
-            <w:bookmarkEnd w:id="0"/>
           </w:p>
         </w:tc>
         <w:tc>
@@ -3379,8 +3377,8 @@
       </w:tblPr>
       <w:tblGrid>
         <w:gridCol w:w="738"/>
-        <w:gridCol w:w="1530"/>
-        <w:gridCol w:w="4050"/>
+        <w:gridCol w:w="1327"/>
+        <w:gridCol w:w="4253"/>
         <w:gridCol w:w="1170"/>
         <w:gridCol w:w="1170"/>
         <w:gridCol w:w="900"/>
@@ -3426,7 +3424,7 @@
         </w:tc>
         <w:tc>
           <w:tcPr>
-            <w:tcW w:w="1530" w:type="dxa"/>
+            <w:tcW w:w="1327" w:type="dxa"/>
             <w:vMerge w:val="restart"/>
             <w:tcBorders>
               <w:right w:val="single" w:sz="4" w:space="0" w:color="auto"/>
@@ -3456,7 +3454,7 @@
         </w:tc>
         <w:tc>
           <w:tcPr>
-            <w:tcW w:w="4050" w:type="dxa"/>
+            <w:tcW w:w="4253" w:type="dxa"/>
             <w:vMerge w:val="restart"/>
             <w:tcBorders>
               <w:left w:val="single" w:sz="4" w:space="0" w:color="auto"/>
@@ -3749,7 +3747,7 @@
         </w:tc>
         <w:tc>
           <w:tcPr>
-            <w:tcW w:w="1530" w:type="dxa"/>
+            <w:tcW w:w="1327" w:type="dxa"/>
             <w:vMerge/>
             <w:tcBorders>
               <w:right w:val="single" w:sz="4" w:space="0" w:color="auto"/>
@@ -3770,7 +3768,7 @@
         </w:tc>
         <w:tc>
           <w:tcPr>
-            <w:tcW w:w="4050" w:type="dxa"/>
+            <w:tcW w:w="4253" w:type="dxa"/>
             <w:vMerge/>
             <w:tcBorders>
               <w:left w:val="single" w:sz="4" w:space="0" w:color="auto"/>
@@ -4037,7 +4035,7 @@
         </w:tc>
         <w:tc>
           <w:tcPr>
-            <w:tcW w:w="1530" w:type="dxa"/>
+            <w:tcW w:w="1327" w:type="dxa"/>
             <w:tcBorders>
               <w:right w:val="single" w:sz="4" w:space="0" w:color="auto"/>
             </w:tcBorders>
@@ -4057,7 +4055,7 @@
         </w:tc>
         <w:tc>
           <w:tcPr>
-            <w:tcW w:w="4050" w:type="dxa"/>
+            <w:tcW w:w="4253" w:type="dxa"/>
             <w:tcBorders>
               <w:left w:val="single" w:sz="4" w:space="0" w:color="auto"/>
             </w:tcBorders>
@@ -4256,7 +4254,7 @@
         </w:tc>
         <w:tc>
           <w:tcPr>
-            <w:tcW w:w="1530" w:type="dxa"/>
+            <w:tcW w:w="1327" w:type="dxa"/>
             <w:tcBorders>
               <w:right w:val="single" w:sz="4" w:space="0" w:color="auto"/>
             </w:tcBorders>
@@ -4276,7 +4274,7 @@
         </w:tc>
         <w:tc>
           <w:tcPr>
-            <w:tcW w:w="4050" w:type="dxa"/>
+            <w:tcW w:w="4253" w:type="dxa"/>
             <w:tcBorders>
               <w:left w:val="single" w:sz="4" w:space="0" w:color="auto"/>
             </w:tcBorders>
@@ -4462,7 +4460,7 @@
         </w:tc>
         <w:tc>
           <w:tcPr>
-            <w:tcW w:w="1530" w:type="dxa"/>
+            <w:tcW w:w="1327" w:type="dxa"/>
             <w:tcBorders>
               <w:right w:val="single" w:sz="4" w:space="0" w:color="auto"/>
             </w:tcBorders>
@@ -4482,7 +4480,7 @@
         </w:tc>
         <w:tc>
           <w:tcPr>
-            <w:tcW w:w="4050" w:type="dxa"/>
+            <w:tcW w:w="4253" w:type="dxa"/>
             <w:tcBorders>
               <w:left w:val="single" w:sz="4" w:space="0" w:color="auto"/>
             </w:tcBorders>
@@ -4791,7 +4789,16 @@
                 <w:sz w:val="32"/>
                 <w:szCs w:val="32"/>
               </w:rPr>
-              <w:t>‡gvU †Z‡ji cwigvb:</w:t>
+              <w:t>‡gvU †Z‡ji cwigvY</w:t>
+            </w:r>
+            <w:r>
+              <w:rPr>
+                <w:rFonts w:ascii="SutonnyMJ" w:hAnsi="SutonnyMJ" w:cs="SutonnyMJ"/>
+                <w:b/>
+                <w:sz w:val="32"/>
+                <w:szCs w:val="32"/>
+              </w:rPr>
+              <w:t>:</w:t>
             </w:r>
           </w:p>
         </w:tc>
@@ -4963,7 +4970,7 @@
                 <w:sz w:val="32"/>
                 <w:szCs w:val="32"/>
               </w:rPr>
-              <w:t xml:space="preserve"> - (wgUvi wiwWs †kl</w:t>
+              <w:t xml:space="preserve"> (wgUvi wiwWs †kl</w:t>
             </w:r>
             <w:r>
               <w:rPr>
@@ -5782,7 +5789,25 @@
                 <w:sz w:val="32"/>
                 <w:szCs w:val="32"/>
               </w:rPr>
-              <w:t>‡gvU G¨vgvD›U(mKj wej):</w:t>
+              <w:t>‡gvU G¨vgvD›U</w:t>
+            </w:r>
+            <w:r>
+              <w:rPr>
+                <w:rFonts w:ascii="SutonnyMJ" w:hAnsi="SutonnyMJ" w:cs="SutonnyMJ"/>
+                <w:b/>
+                <w:sz w:val="32"/>
+                <w:szCs w:val="32"/>
+              </w:rPr>
+              <w:t xml:space="preserve"> </w:t>
+            </w:r>
+            <w:r>
+              <w:rPr>
+                <w:rFonts w:ascii="SutonnyMJ" w:hAnsi="SutonnyMJ" w:cs="SutonnyMJ"/>
+                <w:b/>
+                <w:sz w:val="32"/>
+                <w:szCs w:val="32"/>
+              </w:rPr>
+              <w:t>(mKj wej):</w:t>
             </w:r>
           </w:p>
         </w:tc>
@@ -6673,7 +6698,7 @@
 </file>
 
 <file path=customXml/itemProps1.xml><?xml version="1.0" encoding="utf-8"?>
-<ds:datastoreItem xmlns:ds="http://schemas.openxmlformats.org/officeDocument/2006/customXml" ds:itemID="{8E5DB5D4-D63D-40BA-A8D0-5CC73DEB648A}">
+<ds:datastoreItem xmlns:ds="http://schemas.openxmlformats.org/officeDocument/2006/customXml" ds:itemID="{2CA4E4BF-9652-4755-8186-43B6F7CAE77A}">
   <ds:schemaRefs>
     <ds:schemaRef ds:uri="http://schemas.openxmlformats.org/officeDocument/2006/bibliography"/>
   </ds:schemaRefs>

</xml_diff>